<commit_message>
Fill in author details on cover letter and title page
Co-Authored-By: Claude Sonnet 5.5 <noreply@anthropic.com>
Claude-Session: https://claude.ai/code/session_018rhUQGpSb53LbsAUNxAKLi
</commit_message>
<xml_diff>
--- a/manuscript_revision/manuscript/cover_letter_ms.docx
+++ b/manuscript_revision/manuscript/cover_letter_ms.docx
@@ -202,7 +202,7 @@
           <w:b w:val="0"/>
           <w:i w:val="0"/>
         </w:rPr>
-        <w:t>[Author name]</w:t>
+        <w:t>Ook Lee</w:t>
       </w:r>
     </w:p>
     <w:p>
@@ -214,7 +214,7 @@
           <w:b w:val="0"/>
           <w:i w:val="0"/>
         </w:rPr>
-        <w:t>[Affiliation]</w:t>
+        <w:t>Department of Information Systems, Hanyang University, Seoul, Korea</w:t>
       </w:r>
     </w:p>
     <w:p>
@@ -226,7 +226,7 @@
           <w:b w:val="0"/>
           <w:i w:val="0"/>
         </w:rPr>
-        <w:t>[Email address]</w:t>
+        <w:t>ooklee@hanyang.ac.kr</w:t>
       </w:r>
     </w:p>
     <w:sectPr>

</xml_diff>

<commit_message>
Add AsCollected information sheet and link placeholders (Management Science requirement)
Co-Authored-By: Claude Sonnet 5.5 <noreply@anthropic.com>
Claude-Session: https://claude.ai/code/session_018rhUQGpSb53LbsAUNxAKLi
</commit_message>
<xml_diff>
--- a/manuscript_revision/manuscript/cover_letter_ms.docx
+++ b/manuscript_revision/manuscript/cover_letter_ms.docx
@@ -155,6 +155,12 @@
           <w:i w:val="0"/>
         </w:rPr>
         <w:t>The manuscript is not under review elsewhere and has not been published. [Optional, at the author's discretion: An earlier version was submitted to another journal and declined before external review; the present version has been substantially revised, in particular by formalizing the decision problem and the game and by adding the empirical analysis.] The data used are public, and the code that reproduces the empirical analysis will be deposited as required by the journal's data and code disclosure policy. No human-subjects data were collected. [Statement on the use of generative AI in preparing the manuscript, to be completed in accordance with the journal's policy.] I have no conflicts of interest to declare. [Confirm.]</w:t>
+      </w:r>
+      <w:r>
+        <w:rPr>
+          <w:rFonts w:ascii="Times New Roman" w:hAnsi="Times New Roman"/>
+        </w:rPr>
+        <w:t xml:space="preserve"> The AsCollected project page for this submission is at [AsCollected link to be added].</w:t>
       </w:r>
     </w:p>
     <w:p>

</xml_diff>